<commit_message>
Make the core-v18 footnote cases independent of note-number width
The first CI run showed LibreOffice and Docxodus place a note's first line differently because the
superscript note number differs in width, so position checks now use second note lines. One line
cites both #1179 notes, and the #1180 case cites its note from the kept paragraph.
</commit_message>
<xml_diff>
--- a/fixtures/notes-carried-note-defers-citations.docx
+++ b/fixtures/notes-carried-note-defers-citations.docx
@@ -1128,6 +1128,16 @@
         <w:t xml:space="preserve">DeferredNoteB001 Spruce note line.</w:t>
       </w:r>
     </w:p>
+    <w:p>
+      <w:pPr>
+        <w:widowControl w:val="0"/>
+        <w:spacing w:before="0" w:after="0" w:line="360" w:lineRule="exact"/>
+      </w:pPr>
+      <w:r>
+        <w:rPr/>
+        <w:t xml:space="preserve">DeferredNoteB002 Spruce note line.</w:t>
+      </w:r>
+    </w:p>
   </w:footnote>
   <w:footnote w:id="3">
     <w:p>
@@ -1148,6 +1158,16 @@
       <w:r>
         <w:rPr/>
         <w:t xml:space="preserve">DeferredNoteC001 Spruce note line.</w:t>
+      </w:r>
+    </w:p>
+    <w:p>
+      <w:pPr>
+        <w:widowControl w:val="0"/>
+        <w:spacing w:before="0" w:after="0" w:line="360" w:lineRule="exact"/>
+      </w:pPr>
+      <w:r>
+        <w:rPr/>
+        <w:t xml:space="preserve">DeferredNoteC002 Spruce note line.</w:t>
       </w:r>
     </w:p>
   </w:footnote>

</xml_diff>

<commit_message>
core-v19: make the footnote cases independent of note-number width
The first CI measurement of core-v18 showed LibreOffice and Docxodus start a note's first line at
different x positions, because they draw the superscript note number at different widths. Position
checks on those lines failed for that reason alone, including in the #1179 control. Position checks
now use a note's second line or a body line, so the #1179 and carried-note cases give their short
notes two lines. The #1180 case is rebuilt with a thirty-line note cited on line 31 of page 1 and a
kept paragraph that cites a two-line note. Four note inputs change and the keep-lines table case
changes only its marker, so the suite becomes core-v19; the other 107 inputs are byte-identical.
</commit_message>
<xml_diff>
--- a/fixtures/notes-carried-note-defers-citations.docx
+++ b/fixtures/notes-carried-note-defers-citations.docx
@@ -1128,6 +1128,16 @@
         <w:t xml:space="preserve">DeferredNoteB001 Spruce note line.</w:t>
       </w:r>
     </w:p>
+    <w:p>
+      <w:pPr>
+        <w:widowControl w:val="0"/>
+        <w:spacing w:before="0" w:after="0" w:line="360" w:lineRule="exact"/>
+      </w:pPr>
+      <w:r>
+        <w:rPr/>
+        <w:t xml:space="preserve">DeferredNoteB002 Spruce note line.</w:t>
+      </w:r>
+    </w:p>
   </w:footnote>
   <w:footnote w:id="3">
     <w:p>
@@ -1148,6 +1158,16 @@
       <w:r>
         <w:rPr/>
         <w:t xml:space="preserve">DeferredNoteC001 Spruce note line.</w:t>
+      </w:r>
+    </w:p>
+    <w:p>
+      <w:pPr>
+        <w:widowControl w:val="0"/>
+        <w:spacing w:before="0" w:after="0" w:line="360" w:lineRule="exact"/>
+      </w:pPr>
+      <w:r>
+        <w:rPr/>
+        <w:t xml:space="preserve">DeferredNoteC002 Spruce note line.</w:t>
       </w:r>
     </w:p>
   </w:footnote>

</xml_diff>